<commit_message>
Polish final report and checkpoint documents
</commit_message>
<xml_diff>
--- a/docs/supervisor_checkpoints/checkpoint_01_dataset_setup.docx
+++ b/docs/supervisor_checkpoints/checkpoint_01_dataset_setup.docx
@@ -4,118 +4,405 @@
   <w:body>
     <w:p>
       <w:pPr>
-        <w:pStyle w:val="Heading1"/>
+        <w:jc w:val="center"/>
       </w:pPr>
       <w:r>
-        <w:t>Checkpoint 1: Dataset and Problem Definition</w:t>
+        <w:rPr>
+          <w:b/>
+          <w:color w:val="1F4E79"/>
+          <w:sz w:val="32"/>
+        </w:rPr>
+        <w:t>Checkpoint 1: Dataset Setup</w:t>
       </w:r>
     </w:p>
     <w:p>
       <w:pPr>
-        <w:pStyle w:val="Heading2"/>
+        <w:spacing w:before="140" w:after="40"/>
       </w:pPr>
       <w:r>
+        <w:rPr>
+          <w:b/>
+          <w:sz w:val="24"/>
+        </w:rPr>
         <w:t>Objective</w:t>
       </w:r>
     </w:p>
     <w:p>
+      <w:pPr>
+        <w:spacing w:after="60"/>
+        <w:jc w:val="both"/>
+      </w:pPr>
       <w:r>
-        <w:t>Verify the paired underwater restoration dataset and define the supervised image restoration task.</w:t>
+        <w:t>Verify the paired underwater dataset and define the supervised restoration task.</w:t>
       </w:r>
     </w:p>
     <w:p>
       <w:pPr>
-        <w:pStyle w:val="Heading2"/>
+        <w:spacing w:before="140" w:after="40"/>
       </w:pPr>
       <w:r>
-        <w:t>Work Completed</w:t>
+        <w:rPr>
+          <w:b/>
+          <w:sz w:val="24"/>
+        </w:rPr>
+        <w:t>Key Message</w:t>
+      </w:r>
+    </w:p>
+    <w:p>
+      <w:pPr>
+        <w:spacing w:before="40" w:after="100"/>
+        <w:jc w:val="center"/>
+      </w:pPr>
+      <w:r>
+        <w:rPr>
+          <w:b/>
+          <w:sz w:val="22"/>
+        </w:rPr>
+        <w:t>The project has a clean paired dataset and a fixed split for fair training and testing.</w:t>
+      </w:r>
+    </w:p>
+    <w:p>
+      <w:pPr>
+        <w:spacing w:before="140" w:after="40"/>
+      </w:pPr>
+      <w:r>
+        <w:rPr>
+          <w:b/>
+          <w:sz w:val="24"/>
+        </w:rPr>
+        <w:t>Completed Work</w:t>
       </w:r>
     </w:p>
     <w:p>
       <w:pPr>
         <w:pStyle w:val="ListBullet"/>
+        <w:spacing w:after="20"/>
       </w:pPr>
       <w:r>
-        <w:t>Verified 3672 matched clear/turbid image pairs with no missing pairs.</w:t>
+        <w:t>Verified 3672 matched clear/turbid image pairs.</w:t>
       </w:r>
     </w:p>
     <w:p>
       <w:pPr>
         <w:pStyle w:val="ListBullet"/>
+        <w:spacing w:after="20"/>
       </w:pPr>
       <w:r>
-        <w:t>Generated reproducible train, validation, and test split files.</w:t>
+        <w:t>Created fixed train, validation, and test split files.</w:t>
       </w:r>
     </w:p>
     <w:p>
       <w:pPr>
         <w:pStyle w:val="ListBullet"/>
+        <w:spacing w:after="20"/>
       </w:pPr>
       <w:r>
-        <w:t>Separated paired training data from auxiliary unpaired/video-derived data.</w:t>
+        <w:t>Separated paired training data from unpaired qualitative data.</w:t>
       </w:r>
     </w:p>
     <w:p>
       <w:pPr>
-        <w:pStyle w:val="Heading2"/>
+        <w:spacing w:before="140" w:after="40"/>
       </w:pPr>
       <w:r>
-        <w:t>Evidence to Show</w:t>
+        <w:rPr>
+          <w:b/>
+          <w:sz w:val="24"/>
+        </w:rPr>
+        <w:t>Evidence</w:t>
+      </w:r>
+    </w:p>
+    <w:tbl>
+      <w:tblPr>
+        <w:tblStyle w:val="TableGrid"/>
+        <w:tblW w:type="auto" w:w="0"/>
+        <w:jc w:val="center"/>
+        <w:tblLook w:firstColumn="1" w:firstRow="1" w:lastColumn="0" w:lastRow="0" w:noHBand="0" w:noVBand="1" w:val="04A0"/>
+      </w:tblPr>
+      <w:tblGrid>
+        <w:gridCol w:w="5040"/>
+        <w:gridCol w:w="5040"/>
+      </w:tblGrid>
+      <w:tr>
+        <w:tc>
+          <w:tcPr>
+            <w:tcW w:type="dxa" w:w="5040"/>
+          </w:tcPr>
+          <w:p>
+            <w:pPr>
+              <w:jc w:val="center"/>
+            </w:pPr>
+            <w:r>
+              <w:rPr>
+                <w:rFonts w:ascii="Times New Roman" w:hAnsi="Times New Roman"/>
+                <w:b/>
+                <w:color w:val="1F4E79"/>
+                <w:sz w:val="17"/>
+              </w:rPr>
+              <w:t>Split</w:t>
+            </w:r>
+          </w:p>
+        </w:tc>
+        <w:tc>
+          <w:tcPr>
+            <w:tcW w:type="dxa" w:w="5040"/>
+          </w:tcPr>
+          <w:p>
+            <w:pPr>
+              <w:jc w:val="center"/>
+            </w:pPr>
+            <w:r>
+              <w:rPr>
+                <w:rFonts w:ascii="Times New Roman" w:hAnsi="Times New Roman"/>
+                <w:b/>
+                <w:color w:val="1F4E79"/>
+                <w:sz w:val="17"/>
+              </w:rPr>
+              <w:t>Pairs</w:t>
+            </w:r>
+          </w:p>
+        </w:tc>
+      </w:tr>
+      <w:tr>
+        <w:tc>
+          <w:tcPr>
+            <w:tcW w:type="dxa" w:w="5040"/>
+          </w:tcPr>
+          <w:p>
+            <w:pPr>
+              <w:jc w:val="center"/>
+            </w:pPr>
+            <w:r>
+              <w:rPr>
+                <w:rFonts w:ascii="Times New Roman" w:hAnsi="Times New Roman"/>
+                <w:sz w:val="17"/>
+              </w:rPr>
+              <w:t>Train</w:t>
+            </w:r>
+          </w:p>
+        </w:tc>
+        <w:tc>
+          <w:tcPr>
+            <w:tcW w:type="dxa" w:w="5040"/>
+          </w:tcPr>
+          <w:p>
+            <w:pPr>
+              <w:jc w:val="center"/>
+            </w:pPr>
+            <w:r>
+              <w:rPr>
+                <w:rFonts w:ascii="Times New Roman" w:hAnsi="Times New Roman"/>
+                <w:sz w:val="17"/>
+              </w:rPr>
+              <w:t>2937</w:t>
+            </w:r>
+          </w:p>
+        </w:tc>
+      </w:tr>
+      <w:tr>
+        <w:tc>
+          <w:tcPr>
+            <w:tcW w:type="dxa" w:w="5040"/>
+          </w:tcPr>
+          <w:p>
+            <w:pPr>
+              <w:jc w:val="center"/>
+            </w:pPr>
+            <w:r>
+              <w:rPr>
+                <w:rFonts w:ascii="Times New Roman" w:hAnsi="Times New Roman"/>
+                <w:sz w:val="17"/>
+              </w:rPr>
+              <w:t>Validation</w:t>
+            </w:r>
+          </w:p>
+        </w:tc>
+        <w:tc>
+          <w:tcPr>
+            <w:tcW w:type="dxa" w:w="5040"/>
+          </w:tcPr>
+          <w:p>
+            <w:pPr>
+              <w:jc w:val="center"/>
+            </w:pPr>
+            <w:r>
+              <w:rPr>
+                <w:rFonts w:ascii="Times New Roman" w:hAnsi="Times New Roman"/>
+                <w:sz w:val="17"/>
+              </w:rPr>
+              <w:t>367</w:t>
+            </w:r>
+          </w:p>
+        </w:tc>
+      </w:tr>
+      <w:tr>
+        <w:tc>
+          <w:tcPr>
+            <w:tcW w:type="dxa" w:w="5040"/>
+          </w:tcPr>
+          <w:p>
+            <w:pPr>
+              <w:jc w:val="center"/>
+            </w:pPr>
+            <w:r>
+              <w:rPr>
+                <w:rFonts w:ascii="Times New Roman" w:hAnsi="Times New Roman"/>
+                <w:sz w:val="17"/>
+              </w:rPr>
+              <w:t>Test</w:t>
+            </w:r>
+          </w:p>
+        </w:tc>
+        <w:tc>
+          <w:tcPr>
+            <w:tcW w:type="dxa" w:w="5040"/>
+          </w:tcPr>
+          <w:p>
+            <w:pPr>
+              <w:jc w:val="center"/>
+            </w:pPr>
+            <w:r>
+              <w:rPr>
+                <w:rFonts w:ascii="Times New Roman" w:hAnsi="Times New Roman"/>
+                <w:sz w:val="17"/>
+              </w:rPr>
+              <w:t>368</w:t>
+            </w:r>
+          </w:p>
+        </w:tc>
+      </w:tr>
+    </w:tbl>
+    <w:p/>
+    <w:p>
+      <w:pPr>
+        <w:spacing w:before="40" w:after="20"/>
+        <w:jc w:val="center"/>
+      </w:pPr>
+      <w:r>
+        <w:drawing>
+          <wp:inline xmlns:a="http://schemas.openxmlformats.org/drawingml/2006/main" xmlns:pic="http://schemas.openxmlformats.org/drawingml/2006/picture">
+            <wp:extent cx="5120640" cy="2822917"/>
+            <wp:docPr id="1" name="Picture 1"/>
+            <wp:cNvGraphicFramePr>
+              <a:graphicFrameLocks noChangeAspect="1"/>
+            </wp:cNvGraphicFramePr>
+            <a:graphic>
+              <a:graphicData uri="http://schemas.openxmlformats.org/drawingml/2006/picture">
+                <pic:pic>
+                  <pic:nvPicPr>
+                    <pic:cNvPr id="0" name="paired_underwater_patches.png"/>
+                    <pic:cNvPicPr/>
+                  </pic:nvPicPr>
+                  <pic:blipFill>
+                    <a:blip r:embed="rId9"/>
+                    <a:stretch>
+                      <a:fillRect/>
+                    </a:stretch>
+                  </pic:blipFill>
+                  <pic:spPr>
+                    <a:xfrm>
+                      <a:off x="0" y="0"/>
+                      <a:ext cx="5120640" cy="2822917"/>
+                    </a:xfrm>
+                    <a:prstGeom prst="rect"/>
+                  </pic:spPr>
+                </pic:pic>
+              </a:graphicData>
+            </a:graphic>
+          </wp:inline>
+        </w:drawing>
+      </w:r>
+    </w:p>
+    <w:p>
+      <w:pPr>
+        <w:spacing w:after="100"/>
+        <w:jc w:val="center"/>
+      </w:pPr>
+      <w:r>
+        <w:rPr>
+          <w:i/>
+          <w:sz w:val="17"/>
+        </w:rPr>
+        <w:t>Example verified paired image patch.</w:t>
+      </w:r>
+    </w:p>
+    <w:p>
+      <w:pPr>
+        <w:spacing w:before="40" w:after="20"/>
+        <w:jc w:val="center"/>
+      </w:pPr>
+      <w:r>
+        <w:drawing>
+          <wp:inline xmlns:a="http://schemas.openxmlformats.org/drawingml/2006/main" xmlns:pic="http://schemas.openxmlformats.org/drawingml/2006/picture">
+            <wp:extent cx="5120640" cy="4360728"/>
+            <wp:docPr id="2" name="Picture 2"/>
+            <wp:cNvGraphicFramePr>
+              <a:graphicFrameLocks noChangeAspect="1"/>
+            </wp:cNvGraphicFramePr>
+            <a:graphic>
+              <a:graphicData uri="http://schemas.openxmlformats.org/drawingml/2006/picture">
+                <pic:pic>
+                  <pic:nvPicPr>
+                    <pic:cNvPr id="0" name="candidate_pair_sheet.png"/>
+                    <pic:cNvPicPr/>
+                  </pic:nvPicPr>
+                  <pic:blipFill>
+                    <a:blip r:embed="rId10"/>
+                    <a:stretch>
+                      <a:fillRect/>
+                    </a:stretch>
+                  </pic:blipFill>
+                  <pic:spPr>
+                    <a:xfrm>
+                      <a:off x="0" y="0"/>
+                      <a:ext cx="5120640" cy="4360728"/>
+                    </a:xfrm>
+                    <a:prstGeom prst="rect"/>
+                  </pic:spPr>
+                </pic:pic>
+              </a:graphicData>
+            </a:graphic>
+          </wp:inline>
+        </w:drawing>
+      </w:r>
+    </w:p>
+    <w:p>
+      <w:pPr>
+        <w:spacing w:after="100"/>
+        <w:jc w:val="center"/>
+      </w:pPr>
+      <w:r>
+        <w:rPr>
+          <w:i/>
+          <w:sz w:val="17"/>
+        </w:rPr>
+        <w:t>Dataset pairing examples used during inspection.</w:t>
+      </w:r>
+    </w:p>
+    <w:p>
+      <w:pPr>
+        <w:spacing w:before="140" w:after="40"/>
+      </w:pPr>
+      <w:r>
+        <w:rPr>
+          <w:b/>
+          <w:sz w:val="24"/>
+        </w:rPr>
+        <w:t>Notes</w:t>
       </w:r>
     </w:p>
     <w:p>
       <w:pPr>
         <w:pStyle w:val="ListBullet"/>
+        <w:spacing w:after="20"/>
       </w:pPr>
       <w:r>
-        <w:t>Dataset report</w:t>
-      </w:r>
-    </w:p>
-    <w:p>
-      <w:pPr>
-        <w:pStyle w:val="ListBullet"/>
-      </w:pPr>
-      <w:r>
-        <w:t>Paired image sample grid</w:t>
-      </w:r>
-    </w:p>
-    <w:p>
-      <w:pPr>
-        <w:pStyle w:val="ListBullet"/>
-      </w:pPr>
-      <w:r>
-        <w:t>Split counts: 2937 train, 367 validation, 368 test</w:t>
-      </w:r>
-    </w:p>
-    <w:p>
-      <w:pPr>
-        <w:pStyle w:val="Heading2"/>
-      </w:pPr>
-      <w:r>
-        <w:t>Limitations / Notes</w:t>
-      </w:r>
-    </w:p>
-    <w:p>
-      <w:r>
-        <w:t>This checkpoint summarizes progress evidence. Final quantitative claims are based on the fixed 368-image paired test split.</w:t>
-      </w:r>
-    </w:p>
-    <w:p>
-      <w:pPr>
-        <w:pStyle w:val="Heading2"/>
-      </w:pPr>
-      <w:r>
-        <w:t>Next Step</w:t>
-      </w:r>
-    </w:p>
-    <w:p>
-      <w:r>
-        <w:t>Implement the paired DataLoader and diffusion forward process.</w:t>
+        <w:t>Quantitative metrics are valid only on paired clear/turbid data.</w:t>
       </w:r>
     </w:p>
     <w:sectPr>
       <w:pgSz w:w="12240" w:h="15840"/>
-      <w:pgMar w:top="1440" w:right="1800" w:bottom="1440" w:left="1800" w:header="720" w:footer="720" w:gutter="0"/>
+      <w:pgMar w:top="936" w:right="1080" w:bottom="936" w:left="1080" w:header="720" w:footer="720" w:gutter="0"/>
       <w:cols w:space="720"/>
       <w:docGrid w:linePitch="360"/>
     </w:sectPr>
@@ -486,6 +773,10 @@
     <w:name w:val="Normal"/>
     <w:qFormat/>
     <w:rsid w:val="00FC693F"/>
+    <w:rPr>
+      <w:rFonts w:ascii="Times New Roman" w:hAnsi="Times New Roman"/>
+      <w:sz w:val="21"/>
+    </w:rPr>
   </w:style>
   <w:style w:type="paragraph" w:styleId="Header">
     <w:name w:val="header"/>

</xml_diff>

<commit_message>
Add leakage-safe grouped experiments
</commit_message>
<xml_diff>
--- a/docs/supervisor_checkpoints/checkpoint_01_dataset_setup.docx
+++ b/docs/supervisor_checkpoints/checkpoint_01_dataset_setup.docx
@@ -8,8 +8,9 @@
       </w:pPr>
       <w:r>
         <w:rPr>
+          <w:rFonts w:ascii="Arial" w:hAnsi="Arial"/>
           <w:b/>
-          <w:color w:val="1F4E79"/>
+          <w:color w:val="000000"/>
           <w:sz w:val="32"/>
         </w:rPr>
         <w:t>Checkpoint 1: Dataset Setup</w:t>
@@ -21,6 +22,7 @@
       </w:pPr>
       <w:r>
         <w:rPr>
+          <w:rFonts w:ascii="Arial" w:hAnsi="Arial"/>
           <w:b/>
           <w:sz w:val="24"/>
         </w:rPr>
@@ -42,6 +44,7 @@
       </w:pPr>
       <w:r>
         <w:rPr>
+          <w:rFonts w:ascii="Arial" w:hAnsi="Arial"/>
           <w:b/>
           <w:sz w:val="24"/>
         </w:rPr>
@@ -67,6 +70,7 @@
       </w:pPr>
       <w:r>
         <w:rPr>
+          <w:rFonts w:ascii="Arial" w:hAnsi="Arial"/>
           <w:b/>
           <w:sz w:val="24"/>
         </w:rPr>
@@ -106,6 +110,7 @@
       </w:pPr>
       <w:r>
         <w:rPr>
+          <w:rFonts w:ascii="Arial" w:hAnsi="Arial"/>
           <w:b/>
           <w:sz w:val="24"/>
         </w:rPr>
@@ -120,13 +125,13 @@
         <w:tblLook w:firstColumn="1" w:firstRow="1" w:lastColumn="0" w:lastRow="0" w:noHBand="0" w:noVBand="1" w:val="04A0"/>
       </w:tblPr>
       <w:tblGrid>
-        <w:gridCol w:w="5040"/>
-        <w:gridCol w:w="5040"/>
+        <w:gridCol w:w="4824"/>
+        <w:gridCol w:w="4824"/>
       </w:tblGrid>
       <w:tr>
         <w:tc>
           <w:tcPr>
-            <w:tcW w:type="dxa" w:w="5040"/>
+            <w:tcW w:type="dxa" w:w="4824"/>
           </w:tcPr>
           <w:p>
             <w:pPr>
@@ -134,10 +139,10 @@
             </w:pPr>
             <w:r>
               <w:rPr>
-                <w:rFonts w:ascii="Times New Roman" w:hAnsi="Times New Roman"/>
+                <w:rFonts w:ascii="Calibri" w:hAnsi="Calibri"/>
                 <w:b/>
-                <w:color w:val="1F4E79"/>
-                <w:sz w:val="17"/>
+                <w:color w:val="000000"/>
+                <w:sz w:val="18"/>
               </w:rPr>
               <w:t>Split</w:t>
             </w:r>
@@ -145,7 +150,7 @@
         </w:tc>
         <w:tc>
           <w:tcPr>
-            <w:tcW w:type="dxa" w:w="5040"/>
+            <w:tcW w:type="dxa" w:w="4824"/>
           </w:tcPr>
           <w:p>
             <w:pPr>
@@ -153,10 +158,10 @@
             </w:pPr>
             <w:r>
               <w:rPr>
-                <w:rFonts w:ascii="Times New Roman" w:hAnsi="Times New Roman"/>
+                <w:rFonts w:ascii="Calibri" w:hAnsi="Calibri"/>
                 <w:b/>
-                <w:color w:val="1F4E79"/>
-                <w:sz w:val="17"/>
+                <w:color w:val="000000"/>
+                <w:sz w:val="18"/>
               </w:rPr>
               <w:t>Pairs</w:t>
             </w:r>
@@ -166,7 +171,7 @@
       <w:tr>
         <w:tc>
           <w:tcPr>
-            <w:tcW w:type="dxa" w:w="5040"/>
+            <w:tcW w:type="dxa" w:w="4824"/>
           </w:tcPr>
           <w:p>
             <w:pPr>
@@ -174,8 +179,8 @@
             </w:pPr>
             <w:r>
               <w:rPr>
-                <w:rFonts w:ascii="Times New Roman" w:hAnsi="Times New Roman"/>
-                <w:sz w:val="17"/>
+                <w:rFonts w:ascii="Calibri" w:hAnsi="Calibri"/>
+                <w:sz w:val="18"/>
               </w:rPr>
               <w:t>Train</w:t>
             </w:r>
@@ -183,7 +188,7 @@
         </w:tc>
         <w:tc>
           <w:tcPr>
-            <w:tcW w:type="dxa" w:w="5040"/>
+            <w:tcW w:type="dxa" w:w="4824"/>
           </w:tcPr>
           <w:p>
             <w:pPr>
@@ -191,8 +196,8 @@
             </w:pPr>
             <w:r>
               <w:rPr>
-                <w:rFonts w:ascii="Times New Roman" w:hAnsi="Times New Roman"/>
-                <w:sz w:val="17"/>
+                <w:rFonts w:ascii="Calibri" w:hAnsi="Calibri"/>
+                <w:sz w:val="18"/>
               </w:rPr>
               <w:t>2937</w:t>
             </w:r>
@@ -202,7 +207,7 @@
       <w:tr>
         <w:tc>
           <w:tcPr>
-            <w:tcW w:type="dxa" w:w="5040"/>
+            <w:tcW w:type="dxa" w:w="4824"/>
           </w:tcPr>
           <w:p>
             <w:pPr>
@@ -210,8 +215,8 @@
             </w:pPr>
             <w:r>
               <w:rPr>
-                <w:rFonts w:ascii="Times New Roman" w:hAnsi="Times New Roman"/>
-                <w:sz w:val="17"/>
+                <w:rFonts w:ascii="Calibri" w:hAnsi="Calibri"/>
+                <w:sz w:val="18"/>
               </w:rPr>
               <w:t>Validation</w:t>
             </w:r>
@@ -219,7 +224,7 @@
         </w:tc>
         <w:tc>
           <w:tcPr>
-            <w:tcW w:type="dxa" w:w="5040"/>
+            <w:tcW w:type="dxa" w:w="4824"/>
           </w:tcPr>
           <w:p>
             <w:pPr>
@@ -227,8 +232,8 @@
             </w:pPr>
             <w:r>
               <w:rPr>
-                <w:rFonts w:ascii="Times New Roman" w:hAnsi="Times New Roman"/>
-                <w:sz w:val="17"/>
+                <w:rFonts w:ascii="Calibri" w:hAnsi="Calibri"/>
+                <w:sz w:val="18"/>
               </w:rPr>
               <w:t>367</w:t>
             </w:r>
@@ -238,7 +243,7 @@
       <w:tr>
         <w:tc>
           <w:tcPr>
-            <w:tcW w:type="dxa" w:w="5040"/>
+            <w:tcW w:type="dxa" w:w="4824"/>
           </w:tcPr>
           <w:p>
             <w:pPr>
@@ -246,8 +251,8 @@
             </w:pPr>
             <w:r>
               <w:rPr>
-                <w:rFonts w:ascii="Times New Roman" w:hAnsi="Times New Roman"/>
-                <w:sz w:val="17"/>
+                <w:rFonts w:ascii="Calibri" w:hAnsi="Calibri"/>
+                <w:sz w:val="18"/>
               </w:rPr>
               <w:t>Test</w:t>
             </w:r>
@@ -255,7 +260,7 @@
         </w:tc>
         <w:tc>
           <w:tcPr>
-            <w:tcW w:type="dxa" w:w="5040"/>
+            <w:tcW w:type="dxa" w:w="4824"/>
           </w:tcPr>
           <w:p>
             <w:pPr>
@@ -263,8 +268,8 @@
             </w:pPr>
             <w:r>
               <w:rPr>
-                <w:rFonts w:ascii="Times New Roman" w:hAnsi="Times New Roman"/>
-                <w:sz w:val="17"/>
+                <w:rFonts w:ascii="Calibri" w:hAnsi="Calibri"/>
+                <w:sz w:val="18"/>
               </w:rPr>
               <w:t>368</w:t>
             </w:r>
@@ -272,16 +277,38 @@
         </w:tc>
       </w:tr>
     </w:tbl>
-    <w:p/>
     <w:p>
       <w:pPr>
+        <w:spacing w:before="140" w:after="40"/>
+      </w:pPr>
+      <w:r>
+        <w:rPr>
+          <w:rFonts w:ascii="Arial" w:hAnsi="Arial"/>
+          <w:b/>
+          <w:sz w:val="24"/>
+        </w:rPr>
+        <w:t>Notes</w:t>
+      </w:r>
+    </w:p>
+    <w:p>
+      <w:pPr>
+        <w:pStyle w:val="ListBullet"/>
+        <w:spacing w:after="20"/>
+      </w:pPr>
+      <w:r>
+        <w:t>Quantitative metrics are valid only on paired clear/turbid data.</w:t>
+      </w:r>
+    </w:p>
+    <w:p>
+      <w:pPr>
+        <w:keepNext/>
         <w:spacing w:before="40" w:after="20"/>
         <w:jc w:val="center"/>
       </w:pPr>
       <w:r>
         <w:drawing>
           <wp:inline xmlns:a="http://schemas.openxmlformats.org/drawingml/2006/main" xmlns:pic="http://schemas.openxmlformats.org/drawingml/2006/picture">
-            <wp:extent cx="5120640" cy="2822917"/>
+            <wp:extent cx="5303520" cy="2923735"/>
             <wp:docPr id="1" name="Picture 1"/>
             <wp:cNvGraphicFramePr>
               <a:graphicFrameLocks noChangeAspect="1"/>
@@ -294,7 +321,7 @@
                     <pic:cNvPicPr/>
                   </pic:nvPicPr>
                   <pic:blipFill>
-                    <a:blip r:embed="rId9"/>
+                    <a:blip r:embed="rId10"/>
                     <a:stretch>
                       <a:fillRect/>
                     </a:stretch>
@@ -302,7 +329,7 @@
                   <pic:spPr>
                     <a:xfrm>
                       <a:off x="0" y="0"/>
-                      <a:ext cx="5120640" cy="2822917"/>
+                      <a:ext cx="5303520" cy="2923735"/>
                     </a:xfrm>
                     <a:prstGeom prst="rect"/>
                   </pic:spPr>
@@ -320,6 +347,7 @@
       </w:pPr>
       <w:r>
         <w:rPr>
+          <w:rFonts w:ascii="Calibri" w:hAnsi="Calibri"/>
           <w:i/>
           <w:sz w:val="17"/>
         </w:rPr>
@@ -328,13 +356,14 @@
     </w:p>
     <w:p>
       <w:pPr>
+        <w:keepNext/>
         <w:spacing w:before="40" w:after="20"/>
         <w:jc w:val="center"/>
       </w:pPr>
       <w:r>
         <w:drawing>
           <wp:inline xmlns:a="http://schemas.openxmlformats.org/drawingml/2006/main" xmlns:pic="http://schemas.openxmlformats.org/drawingml/2006/picture">
-            <wp:extent cx="5120640" cy="4360728"/>
+            <wp:extent cx="5303520" cy="4516467"/>
             <wp:docPr id="2" name="Picture 2"/>
             <wp:cNvGraphicFramePr>
               <a:graphicFrameLocks noChangeAspect="1"/>
@@ -347,7 +376,7 @@
                     <pic:cNvPicPr/>
                   </pic:nvPicPr>
                   <pic:blipFill>
-                    <a:blip r:embed="rId10"/>
+                    <a:blip r:embed="rId11"/>
                     <a:stretch>
                       <a:fillRect/>
                     </a:stretch>
@@ -355,7 +384,7 @@
                   <pic:spPr>
                     <a:xfrm>
                       <a:off x="0" y="0"/>
-                      <a:ext cx="5120640" cy="4360728"/>
+                      <a:ext cx="5303520" cy="4516467"/>
                     </a:xfrm>
                     <a:prstGeom prst="rect"/>
                   </pic:spPr>
@@ -373,41 +402,39 @@
       </w:pPr>
       <w:r>
         <w:rPr>
+          <w:rFonts w:ascii="Calibri" w:hAnsi="Calibri"/>
           <w:i/>
           <w:sz w:val="17"/>
         </w:rPr>
         <w:t>Dataset pairing examples used during inspection.</w:t>
       </w:r>
     </w:p>
-    <w:p>
-      <w:pPr>
-        <w:spacing w:before="140" w:after="40"/>
-      </w:pPr>
-      <w:r>
-        <w:rPr>
-          <w:b/>
-          <w:sz w:val="24"/>
-        </w:rPr>
-        <w:t>Notes</w:t>
-      </w:r>
-    </w:p>
-    <w:p>
-      <w:pPr>
-        <w:pStyle w:val="ListBullet"/>
-        <w:spacing w:after="20"/>
-      </w:pPr>
-      <w:r>
-        <w:t>Quantitative metrics are valid only on paired clear/turbid data.</w:t>
-      </w:r>
-    </w:p>
     <w:sectPr>
+      <w:footerReference w:type="default" r:id="rId9"/>
       <w:pgSz w:w="12240" w:h="15840"/>
-      <w:pgMar w:top="936" w:right="1080" w:bottom="936" w:left="1080" w:header="720" w:footer="720" w:gutter="0"/>
+      <w:pgMar w:top="1152" w:right="1296" w:bottom="1008" w:left="1296" w:header="720" w:footer="432" w:gutter="0"/>
       <w:cols w:space="720"/>
       <w:docGrid w:linePitch="360"/>
     </w:sectPr>
   </w:body>
 </w:document>
+</file>
+
+<file path=word/footer1.xml><?xml version="1.0" encoding="utf-8"?>
+<w:ftr xmlns:m="http://schemas.openxmlformats.org/officeDocument/2006/math" xmlns:mc="http://schemas.openxmlformats.org/markup-compatibility/2006" xmlns:mo="http://schemas.microsoft.com/office/mac/office/2008/main" xmlns:mv="urn:schemas-microsoft-com:mac:vml" xmlns:o="urn:schemas-microsoft-com:office:office" xmlns:r="http://schemas.openxmlformats.org/officeDocument/2006/relationships" xmlns:v="urn:schemas-microsoft-com:vml" xmlns:w10="urn:schemas-microsoft-com:office:word" xmlns:w14="http://schemas.microsoft.com/office/word/2010/wordml" xmlns:w="http://schemas.openxmlformats.org/wordprocessingml/2006/main" xmlns:wne="http://schemas.microsoft.com/office/word/2006/wordml" xmlns:wp14="http://schemas.microsoft.com/office/word/2010/wordprocessingDrawing" xmlns:wp="http://schemas.openxmlformats.org/drawingml/2006/wordprocessingDrawing" xmlns:wpc="http://schemas.microsoft.com/office/word/2010/wordprocessingCanvas" xmlns:wpg="http://schemas.microsoft.com/office/word/2010/wordprocessingGroup" xmlns:wpi="http://schemas.microsoft.com/office/word/2010/wordprocessingInk" xmlns:wps="http://schemas.microsoft.com/office/word/2010/wordprocessingShape" mc:Ignorable="w14 wp14">
+  <w:p>
+    <w:pPr>
+      <w:pStyle w:val="Footer"/>
+      <w:jc w:val="right"/>
+    </w:pPr>
+    <w:r>
+      <w:fldChar w:fldCharType="begin"/>
+      <w:instrText xml:space="preserve"> PAGE </w:instrText>
+      <w:fldChar w:fldCharType="separate"/>
+      <w:fldChar w:fldCharType="end"/>
+    </w:r>
+  </w:p>
+</w:ftr>
 </file>
 
 <file path=word/numbering.xml><?xml version="1.0" encoding="utf-8"?>
@@ -774,8 +801,8 @@
     <w:qFormat/>
     <w:rsid w:val="00FC693F"/>
     <w:rPr>
-      <w:rFonts w:ascii="Times New Roman" w:hAnsi="Times New Roman"/>
-      <w:sz w:val="21"/>
+      <w:rFonts w:ascii="Calibri" w:hAnsi="Calibri"/>
+      <w:sz w:val="22"/>
     </w:rPr>
   </w:style>
   <w:style w:type="paragraph" w:styleId="Header">
@@ -1306,6 +1333,10 @@
       </w:numPr>
       <w:contextualSpacing/>
     </w:pPr>
+    <w:rPr>
+      <w:rFonts w:ascii="Calibri" w:hAnsi="Calibri"/>
+      <w:sz w:val="22"/>
+    </w:rPr>
   </w:style>
   <w:style w:type="paragraph" w:styleId="ListBullet2">
     <w:name w:val="List Bullet 2"/>

</xml_diff>

<commit_message>
Refresh deliverables with grouped results
</commit_message>
<xml_diff>
--- a/docs/supervisor_checkpoints/checkpoint_01_dataset_setup.docx
+++ b/docs/supervisor_checkpoints/checkpoint_01_dataset_setup.docx
@@ -61,7 +61,7 @@
           <w:b/>
           <w:sz w:val="22"/>
         </w:rPr>
-        <w:t>The project has a clean paired dataset and a fixed split for fair training and testing.</w:t>
+        <w:t>The active protocol uses grouped source assignments and exact-pair deduplication for more defensible training and testing.</w:t>
       </w:r>
     </w:p>
     <w:p>
@@ -92,7 +92,7 @@
         <w:spacing w:after="20"/>
       </w:pPr>
       <w:r>
-        <w:t>Created fixed train, validation, and test split files.</w:t>
+        <w:t>Created contiguous source-group split files and a duplicate audit.</w:t>
       </w:r>
     </w:p>
     <w:p>
@@ -199,7 +199,7 @@
                 <w:rFonts w:ascii="Calibri" w:hAnsi="Calibri"/>
                 <w:sz w:val="18"/>
               </w:rPr>
-              <w:t>2937</w:t>
+              <w:t>2899</w:t>
             </w:r>
           </w:p>
         </w:tc>
@@ -235,7 +235,7 @@
                 <w:rFonts w:ascii="Calibri" w:hAnsi="Calibri"/>
                 <w:sz w:val="18"/>
               </w:rPr>
-              <w:t>367</w:t>
+              <w:t>357</w:t>
             </w:r>
           </w:p>
         </w:tc>
@@ -271,7 +271,7 @@
                 <w:rFonts w:ascii="Calibri" w:hAnsi="Calibri"/>
                 <w:sz w:val="18"/>
               </w:rPr>
-              <w:t>368</w:t>
+              <w:t>384</w:t>
             </w:r>
           </w:p>
         </w:tc>

</xml_diff>

<commit_message>
Polish report and checkpoint artifacts
</commit_message>
<xml_diff>
--- a/docs/supervisor_checkpoints/checkpoint_01_dataset_setup.docx
+++ b/docs/supervisor_checkpoints/checkpoint_01_dataset_setup.docx
@@ -102,6 +102,46 @@
       </w:pPr>
       <w:r>
         <w:t>Separated paired training data from unpaired qualitative data.</w:t>
+      </w:r>
+    </w:p>
+    <w:p>
+      <w:pPr>
+        <w:spacing w:before="140" w:after="40"/>
+      </w:pPr>
+      <w:r>
+        <w:rPr>
+          <w:rFonts w:ascii="Arial" w:hAnsi="Arial"/>
+          <w:b/>
+          <w:sz w:val="24"/>
+        </w:rPr>
+        <w:t>Verification and Controls</w:t>
+      </w:r>
+    </w:p>
+    <w:p>
+      <w:pPr>
+        <w:pStyle w:val="ListBullet"/>
+        <w:spacing w:after="20"/>
+      </w:pPr>
+      <w:r>
+        <w:t>Checked filename correspondence, readable image dimensions, and one-to-one source-target pairing before training.</w:t>
+      </w:r>
+    </w:p>
+    <w:p>
+      <w:pPr>
+        <w:pStyle w:val="ListBullet"/>
+        <w:spacing w:after="20"/>
+      </w:pPr>
+      <w:r>
+        <w:t>Removed 32 exact duplicate records before assigning whole content groups to a single split.</w:t>
+      </w:r>
+    </w:p>
+    <w:p>
+      <w:pPr>
+        <w:pStyle w:val="ListBullet"/>
+        <w:spacing w:after="20"/>
+      </w:pPr>
+      <w:r>
+        <w:t>Saved deterministic manifests so every later model uses the same 2,899/357/384 partition.</w:t>
       </w:r>
     </w:p>
     <w:p>
@@ -277,6 +317,32 @@
         </w:tc>
       </w:tr>
     </w:tbl>
+    <w:p>
+      <w:pPr>
+        <w:spacing w:before="140" w:after="40"/>
+      </w:pPr>
+      <w:r>
+        <w:rPr>
+          <w:rFonts w:ascii="Arial" w:hAnsi="Arial"/>
+          <w:b/>
+          <w:sz w:val="24"/>
+        </w:rPr>
+        <w:t>Decision / Next Gate</w:t>
+      </w:r>
+    </w:p>
+    <w:p>
+      <w:pPr>
+        <w:spacing w:before="40" w:after="100"/>
+        <w:jc w:val="center"/>
+      </w:pPr>
+      <w:r>
+        <w:rPr>
+          <w:b/>
+          <w:sz w:val="22"/>
+        </w:rPr>
+        <w:t>Freeze the grouped manifests; use validation for model selection and reserve the test set for final reporting.</w:t>
+      </w:r>
+    </w:p>
     <w:p>
       <w:pPr>
         <w:spacing w:before="140" w:after="40"/>

</xml_diff>